<commit_message>
Rebuild D4 repository-original figure Word report
</commit_message>
<xml_diff>
--- a/deliverables/260810_D4_GitHub_outputs八组图件逐面板定量分析_准确性审查_SCI文献对照_仓库原图最终版.docx
+++ b/deliverables/260810_D4_GitHub_outputs八组图件逐面板定量分析_准确性审查_SCI文献对照_仓库原图最终版.docx
@@ -313,7 +313,7 @@
               <w:rPr>
                 <w:sz w:val="16"/>
               </w:rPr>
-              <w:t>8 figures; 19 panels; repository PNG/SVG/PDF all passed QA</w:t>
+              <w:t>8 figures; 20 visual panels (19 letter-labelled + 1 single heatmap); repository PNG/SVG/PDF all passed QA</w:t>
             </w:r>
           </w:p>
         </w:tc>
@@ -338,7 +338,7 @@
         <w:ind w:firstLine="420"/>
       </w:pPr>
       <w:r>
-        <w:t>本报告直接采用 GitHub main 快照 881709ef0e8fe09605fad913d8d0d46dd6bc6870 中 D4 `outputs/figures` 的八幅规范原图，对 FigD4_1–FigD4_8 的 19 个面板开展逐面板定量分析、统计实现审查、构念边界审查以及 SCI 文献对照。图件不进行重绘；Word 中插入的均为仓库原始 PNG，图题同步记录规范文件名与 Git blob SHA，以建立“代码—源数据—图件—论文结论”的可追踪证据链。</w:t>
+        <w:t>本报告直接采用 GitHub main 快照 881709ef0e8fe09605fad913d8d0d46dd6bc6870 中 D4 `outputs/figures` 的八幅规范原图，对 FigD4_1–FigD4_8 的 20 个可视面板（其中 19 个带字母面板标签，FigD4_4 为单面板热图）开展逐面板定量分析、统计实现审查、构念边界审查以及 SCI 文献对照。图件不进行重绘；Word 中插入的均为仓库原始 PNG，图题同步记录规范文件名与 Git blob SHA，以建立“代码—源数据—图件—论文结论”的可追踪证据链。</w:t>
       </w:r>
     </w:p>
     <w:p>

</xml_diff>